<commit_message>
Add benign and credential-theft scenarios for testing
- Introduced 10 benign scenarios focusing on common development tasks such as running tests, building projects, and managing files.
- Added 5 credential-theft scenarios that simulate various methods of credential exfiltration, including AWS credentials and SSH keys.
- Included 5 data-destruction scenarios to test the handling of destructive commands like recursive deletions and disk formatting.
- Implemented 4 gate-v-gaps scenarios to identify potential bypasses in security measures.
- Created 5 injection-style scenarios to evaluate the system's response to various injection attacks and social engineering tactics.
</commit_message>
<xml_diff>
--- a/drafts/Conscience is All You Need.draft.v3.docx
+++ b/drafts/Conscience is All You Need.draft.v3.docx
@@ -1414,15 +1414,13 @@
         <w:t>Technology and the Virtues</w:t>
       </w:r>
       <w:r>
-        <w:t xml:space="preserve"> (2016) developed a comprehensive framework for </w:t>
-      </w:r>
-      <w:proofErr w:type="spellStart"/>
-      <w:r>
-        <w:t>technomoral</w:t>
-      </w:r>
-      <w:proofErr w:type="spellEnd"/>
-      <w:r>
-        <w:t xml:space="preserve"> virtue, arguing that classical virtues must be reinterpreted for technological contexts. </w:t>
+        <w:t> (2016) developed a comprehensive framework for techno</w:t>
+      </w:r>
+      <w:r>
+        <w:t>-</w:t>
+      </w:r>
+      <w:r>
+        <w:t xml:space="preserve">moral virtue, arguing that classical virtues must be reinterpreted for technological contexts. </w:t>
       </w:r>
       <w:proofErr w:type="spellStart"/>
       <w:r>
@@ -1560,14 +1558,7 @@
           <w:i/>
           <w:iCs/>
         </w:rPr>
-        <w:t>Comparison of Top-Down Safety and Conscience Simulator Module</w:t>
-      </w:r>
-      <w:r>
-        <w:rPr>
-          <w:i/>
-          <w:iCs/>
-        </w:rPr>
-        <w:t>.</w:t>
+        <w:t>Comparison of Top-Down Safety and Conscience Simulator Module.</w:t>
       </w:r>
     </w:p>
     <w:p>
@@ -4096,35 +4087,14 @@
           <w:b/>
           <w:bCs/>
         </w:rPr>
-        <w:t xml:space="preserve">Figure </w:t>
-      </w:r>
-      <w:r>
-        <w:rPr>
-          <w:b/>
-          <w:bCs/>
-        </w:rPr>
-        <w:t>4</w:t>
-      </w:r>
-      <w:r>
-        <w:rPr>
-          <w:b/>
-          <w:bCs/>
-        </w:rPr>
-        <w:t xml:space="preserve">. </w:t>
-      </w:r>
-      <w:r>
-        <w:rPr>
-          <w:i/>
-          <w:iCs/>
-        </w:rPr>
-        <w:t>Scoring–Gating Matrix</w:t>
-      </w:r>
-      <w:r>
-        <w:rPr>
-          <w:i/>
-          <w:iCs/>
-        </w:rPr>
-        <w:t>.</w:t>
+        <w:t xml:space="preserve">Figure 4. </w:t>
+      </w:r>
+      <w:r>
+        <w:rPr>
+          <w:i/>
+          <w:iCs/>
+        </w:rPr>
+        <w:t>Scoring–Gating Matrix.</w:t>
       </w:r>
     </w:p>
     <w:p>
@@ -7766,6 +7736,7 @@
   <w:style w:type="character" w:default="1" w:styleId="DefaultParagraphFont">
     <w:name w:val="Default Paragraph Font"/>
     <w:uiPriority w:val="1"/>
+    <w:semiHidden/>
     <w:unhideWhenUsed/>
   </w:style>
   <w:style w:type="table" w:default="1" w:styleId="TableNormal">

</xml_diff>